<commit_message>
Update invoice documents for Best Western Garden Hotel
- Revised `FBMC_INV_2026_0720_001.docx` and `FBMC_INV_2026_0720_001.pdf` to enhance formatting and clarity, including adjustments to the layout and alignment of text.
- Added a section for Medical / Occupational Health Services to specify the nature of the invoice.
- Included payment instructions and expressed appreciation for the client's partnership with FairBanks Medical Centre.
</commit_message>
<xml_diff>
--- a/FBMC_INV_2026_0720_001.docx
+++ b/FBMC_INV_2026_0720_001.docx
@@ -5,26 +5,34 @@
     <w:tbl>
       <w:tblPr>
         <w:tblW w:type="auto" w:w="0"/>
-        <w:tblLayout w:type="autofit"/>
+        <w:tblLayout w:type="fixed"/>
         <w:tblLook w:firstColumn="1" w:firstRow="1" w:lastColumn="0" w:lastRow="0" w:noHBand="0" w:noVBand="1" w:val="04A0"/>
       </w:tblPr>
       <w:tblGrid>
-        <w:gridCol w:w="5213"/>
-        <w:gridCol w:w="5213"/>
+        <w:gridCol w:w="3402"/>
+        <w:gridCol w:w="3402"/>
+        <w:gridCol w:w="3402"/>
       </w:tblGrid>
       <w:tr>
         <w:tc>
           <w:tcPr>
-            <w:tcW w:type="dxa" w:w="5213"/>
+            <w:tcW w:type="dxa" w:w="1587"/>
+            <w:shd w:fill="E8F3F2" w:val="clear"/>
+            <w:tcBorders>
+              <w:top w:val="nil"/>
+              <w:left w:val="nil"/>
+              <w:bottom w:val="nil"/>
+              <w:right w:val="nil"/>
+            </w:tcBorders>
           </w:tcPr>
           <w:p>
             <w:pPr>
-              <w:spacing w:before="0" w:after="0" w:line="276" w:lineRule="auto"/>
+              <w:spacing w:before="0" w:after="0" w:line="264" w:lineRule="auto"/>
             </w:pPr>
             <w:r>
               <w:drawing>
                 <wp:inline xmlns:a="http://schemas.openxmlformats.org/drawingml/2006/main" xmlns:pic="http://schemas.openxmlformats.org/drawingml/2006/picture">
-                  <wp:extent cx="868680" cy="326159"/>
+                  <wp:extent cx="822960" cy="308992"/>
                   <wp:docPr id="1" name="Picture 1"/>
                   <wp:cNvGraphicFramePr>
                     <a:graphicFrameLocks noChangeAspect="1"/>
@@ -45,7 +53,7 @@
                         <pic:spPr>
                           <a:xfrm>
                             <a:off x="0" y="0"/>
-                            <a:ext cx="868680" cy="326159"/>
+                            <a:ext cx="822960" cy="308992"/>
                           </a:xfrm>
                           <a:prstGeom prst="rect"/>
                         </pic:spPr>
@@ -56,9 +64,21 @@
               </w:drawing>
             </w:r>
           </w:p>
+        </w:tc>
+        <w:tc>
+          <w:tcPr>
+            <w:tcW w:type="dxa" w:w="5953"/>
+            <w:shd w:fill="E8F3F2" w:val="clear"/>
+            <w:tcBorders>
+              <w:top w:val="nil"/>
+              <w:left w:val="nil"/>
+              <w:bottom w:val="nil"/>
+              <w:right w:val="nil"/>
+            </w:tcBorders>
+          </w:tcPr>
           <w:p>
             <w:pPr>
-              <w:spacing w:before="0" w:after="0" w:line="276" w:lineRule="auto"/>
+              <w:spacing w:before="0" w:after="0" w:line="264" w:lineRule="auto"/>
             </w:pPr>
             <w:r>
               <w:rPr>
@@ -73,7 +93,7 @@
           </w:p>
           <w:p>
             <w:pPr>
-              <w:spacing w:before="0" w:after="0" w:line="276" w:lineRule="auto"/>
+              <w:spacing w:before="0" w:after="0" w:line="264" w:lineRule="auto"/>
             </w:pPr>
             <w:r>
               <w:rPr>
@@ -88,7 +108,7 @@
           </w:p>
           <w:p>
             <w:pPr>
-              <w:spacing w:before="0" w:after="0" w:line="276" w:lineRule="auto"/>
+              <w:spacing w:before="0" w:after="0" w:line="264" w:lineRule="auto"/>
             </w:pPr>
             <w:r>
               <w:rPr>
@@ -98,27 +118,25 @@
                 <w:color w:val="52636C"/>
                 <w:sz w:val="17"/>
               </w:rPr>
-              <w:t>Kyebando Kisalosalo, Tirupati Road, Opposite Northern Bypass Roundabout</w:t>
+              <w:t>Kyebando Kisalosalo, Tirupati Road, Opposite Northern Bypass Roundabout, Kampala, Uganda</w:t>
             </w:r>
           </w:p>
+        </w:tc>
+        <w:tc>
+          <w:tcPr>
+            <w:tcW w:type="dxa" w:w="2665"/>
+            <w:shd w:fill="E8F3F2" w:val="clear"/>
+            <w:tcBorders>
+              <w:top w:val="nil"/>
+              <w:left w:val="nil"/>
+              <w:bottom w:val="nil"/>
+              <w:right w:val="nil"/>
+            </w:tcBorders>
+          </w:tcPr>
           <w:p>
             <w:pPr>
-              <w:spacing w:before="0" w:after="0" w:line="276" w:lineRule="auto"/>
-            </w:pPr>
-            <w:r>
-              <w:rPr>
-                <w:rFonts w:ascii="Calibri" w:hAnsi="Calibri"/>
-                <w:b w:val="0"/>
-                <w:i w:val="0"/>
-                <w:color w:val="52636C"/>
-                <w:sz w:val="17"/>
-              </w:rPr>
-              <w:t>Kampala, Uganda</w:t>
-            </w:r>
-          </w:p>
-          <w:p>
-            <w:pPr>
-              <w:spacing w:before="0" w:after="0" w:line="276" w:lineRule="auto"/>
+              <w:spacing w:before="0" w:after="0" w:line="264" w:lineRule="auto"/>
+              <w:jc w:val="right"/>
             </w:pPr>
             <w:r>
               <w:rPr>
@@ -133,7 +151,8 @@
           </w:p>
           <w:p>
             <w:pPr>
-              <w:spacing w:before="0" w:after="0" w:line="276" w:lineRule="auto"/>
+              <w:spacing w:before="0" w:after="0" w:line="264" w:lineRule="auto"/>
+              <w:jc w:val="right"/>
             </w:pPr>
             <w:r>
               <w:rPr>
@@ -148,7 +167,8 @@
           </w:p>
           <w:p>
             <w:pPr>
-              <w:spacing w:before="0" w:after="0" w:line="276" w:lineRule="auto"/>
+              <w:spacing w:before="0" w:after="0" w:line="264" w:lineRule="auto"/>
+              <w:jc w:val="right"/>
             </w:pPr>
             <w:r>
               <w:rPr>
@@ -162,69 +182,123 @@
             </w:r>
           </w:p>
         </w:tc>
+      </w:tr>
+    </w:tbl>
+    <w:p>
+      <w:pPr>
+        <w:spacing w:before="0" w:after="160" w:line="264" w:lineRule="auto"/>
+        <w:pBdr>
+          <w:bottom w:val="single" w:sz="36" w:color="0D6E6E"/>
+        </w:pBdr>
+      </w:pPr>
+    </w:p>
+    <w:tbl>
+      <w:tblPr>
+        <w:tblW w:type="auto" w:w="0"/>
+        <w:tblLayout w:type="fixed"/>
+        <w:tblLook w:firstColumn="1" w:firstRow="1" w:lastColumn="0" w:lastRow="0" w:noHBand="0" w:noVBand="1" w:val="04A0"/>
+      </w:tblPr>
+      <w:tblGrid>
+        <w:gridCol w:w="5103"/>
+        <w:gridCol w:w="5103"/>
+      </w:tblGrid>
+      <w:tr>
         <w:tc>
           <w:tcPr>
-            <w:tcW w:type="dxa" w:w="5213"/>
-            <w:shd w:fill="F7F5F0" w:val="clear"/>
+            <w:tcW w:type="dxa" w:w="4252"/>
+            <w:shd w:fill="0D6E6E" w:val="clear"/>
+            <w:tcBorders>
+              <w:top w:val="nil"/>
+              <w:left w:val="nil"/>
+              <w:bottom w:val="nil"/>
+              <w:right w:val="nil"/>
+            </w:tcBorders>
           </w:tcPr>
           <w:p>
             <w:pPr>
-              <w:spacing w:before="0" w:after="80" w:line="276" w:lineRule="auto"/>
+              <w:spacing w:before="0" w:after="0" w:line="264" w:lineRule="auto"/>
             </w:pPr>
             <w:r>
               <w:rPr>
                 <w:rFonts w:ascii="Calibri" w:hAnsi="Calibri"/>
                 <w:b/>
                 <w:i w:val="0"/>
-                <w:color w:val="0A1F2E"/>
-                <w:sz w:val="40"/>
+                <w:color w:val="FFFFFF"/>
+                <w:sz w:val="36"/>
               </w:rPr>
               <w:t>INVOICE</w:t>
             </w:r>
           </w:p>
           <w:p>
             <w:pPr>
-              <w:spacing w:before="0" w:after="80" w:line="276" w:lineRule="auto"/>
+              <w:spacing w:before="0" w:after="0" w:line="264" w:lineRule="auto"/>
+            </w:pPr>
+            <w:r>
+              <w:rPr>
+                <w:rFonts w:ascii="Calibri" w:hAnsi="Calibri"/>
+                <w:b w:val="0"/>
+                <w:i w:val="0"/>
+                <w:color w:val="B8D4D3"/>
+                <w:sz w:val="16"/>
+              </w:rPr>
+              <w:t>Medical / Occupational Health Services</w:t>
+            </w:r>
+          </w:p>
+        </w:tc>
+        <w:tc>
+          <w:tcPr>
+            <w:tcW w:type="dxa" w:w="5953"/>
+            <w:shd w:fill="0D6E6E" w:val="clear"/>
+            <w:tcBorders>
+              <w:top w:val="nil"/>
+              <w:left w:val="nil"/>
+              <w:bottom w:val="nil"/>
+              <w:right w:val="nil"/>
+            </w:tcBorders>
+          </w:tcPr>
+          <w:p>
+            <w:pPr>
+              <w:spacing w:before="0" w:after="0" w:line="264" w:lineRule="auto"/>
             </w:pPr>
             <w:r>
               <w:rPr>
                 <w:rFonts w:ascii="Calibri" w:hAnsi="Calibri"/>
                 <w:b/>
                 <w:i w:val="0"/>
-                <w:color w:val="1E2F38"/>
+                <w:color w:val="FFFFFF"/>
                 <w:sz w:val="18"/>
               </w:rPr>
-              <w:t>Invoice No.: FBMC/INV/2026/0720/001</w:t>
+              <w:t>Invoice No.:  FBMC/INV/2026/0720/001</w:t>
             </w:r>
           </w:p>
           <w:p>
             <w:pPr>
-              <w:spacing w:before="0" w:after="80" w:line="276" w:lineRule="auto"/>
+              <w:spacing w:before="0" w:after="0" w:line="264" w:lineRule="auto"/>
             </w:pPr>
             <w:r>
               <w:rPr>
                 <w:rFonts w:ascii="Calibri" w:hAnsi="Calibri"/>
                 <w:b/>
                 <w:i w:val="0"/>
-                <w:color w:val="1E2F38"/>
+                <w:color w:val="FFFFFF"/>
                 <w:sz w:val="18"/>
               </w:rPr>
-              <w:t>Invoice Date: 20th July 2026</w:t>
+              <w:t>Invoice Date:  20th July 2026</w:t>
             </w:r>
           </w:p>
           <w:p>
             <w:pPr>
-              <w:spacing w:before="0" w:after="80" w:line="276" w:lineRule="auto"/>
+              <w:spacing w:before="0" w:after="0" w:line="264" w:lineRule="auto"/>
             </w:pPr>
             <w:r>
               <w:rPr>
                 <w:rFonts w:ascii="Calibri" w:hAnsi="Calibri"/>
                 <w:b/>
                 <w:i w:val="0"/>
-                <w:color w:val="1E2F38"/>
+                <w:color w:val="FFFFFF"/>
                 <w:sz w:val="18"/>
               </w:rPr>
-              <w:t>Payment Terms: Within Seven (7) Days</w:t>
+              <w:t>Payment Terms:  Within Seven (7) Days</w:t>
             </w:r>
           </w:p>
         </w:tc>
@@ -232,50 +306,49 @@
     </w:tbl>
     <w:p>
       <w:pPr>
-        <w:spacing w:before="160" w:after="160" w:line="276" w:lineRule="auto"/>
-        <w:pBdr>
-          <w:bottom w:val="single" w:sz="24" w:color="0D6E6E"/>
-        </w:pBdr>
+        <w:spacing w:before="200" w:after="0" w:line="264" w:lineRule="auto"/>
       </w:pPr>
-    </w:p>
-    <w:p>
-      <w:pPr>
-        <w:spacing w:before="0" w:after="80" w:line="276" w:lineRule="auto"/>
-      </w:pPr>
-      <w:r>
-        <w:rPr>
-          <w:rFonts w:ascii="Calibri" w:hAnsi="Calibri"/>
-          <w:b/>
-          <w:i w:val="0"/>
-          <w:color w:val="0D6E6E"/>
-          <w:sz w:val="22"/>
-        </w:rPr>
-        <w:t>Bill To</w:t>
-      </w:r>
     </w:p>
     <w:tbl>
       <w:tblPr>
         <w:tblW w:type="auto" w:w="0"/>
+        <w:tblLayout w:type="fixed"/>
         <w:tblLook w:firstColumn="1" w:firstRow="1" w:lastColumn="0" w:lastRow="0" w:noHBand="0" w:noVBand="1" w:val="04A0"/>
       </w:tblPr>
       <w:tblGrid>
-        <w:gridCol w:w="10426"/>
+        <w:gridCol w:w="5103"/>
+        <w:gridCol w:w="5103"/>
       </w:tblGrid>
       <w:tr>
         <w:tc>
           <w:tcPr>
-            <w:tcW w:type="dxa" w:w="10426"/>
-            <w:shd w:fill="E8F3F2" w:val="clear"/>
+            <w:tcW w:type="dxa" w:w="5102"/>
+            <w:shd w:fill="F7F5F0" w:val="clear"/>
             <w:tcBorders>
-              <w:top w:val="single" w:sz="4" w:color="CED9D8"/>
-              <w:left w:val="single" w:sz="4" w:color="CED9D8"/>
-              <w:bottom w:val="single" w:sz="4" w:color="CED9D8"/>
-              <w:right w:val="single" w:sz="4" w:color="CED9D8"/>
+              <w:top w:val="single" w:sz="6" w:color="CED9D8"/>
+              <w:left w:val="single" w:sz="6" w:color="CED9D8"/>
+              <w:bottom w:val="single" w:sz="6" w:color="CED9D8"/>
+              <w:right w:val="single" w:sz="6" w:color="CED9D8"/>
             </w:tcBorders>
           </w:tcPr>
           <w:p>
             <w:pPr>
-              <w:spacing w:before="0" w:after="0" w:line="276" w:lineRule="auto"/>
+              <w:spacing w:before="0" w:after="0" w:line="264" w:lineRule="auto"/>
+            </w:pPr>
+            <w:r>
+              <w:rPr>
+                <w:rFonts w:ascii="Calibri" w:hAnsi="Calibri"/>
+                <w:b/>
+                <w:i w:val="0"/>
+                <w:color w:val="0D6E6E"/>
+                <w:sz w:val="21"/>
+              </w:rPr>
+              <w:t>Bill To</w:t>
+            </w:r>
+          </w:p>
+          <w:p>
+            <w:pPr>
+              <w:spacing w:before="0" w:after="0" w:line="264" w:lineRule="auto"/>
             </w:pPr>
             <w:r>
               <w:rPr>
@@ -288,23 +361,9 @@
               <w:t>Best Western Garden Hotel</w:t>
             </w:r>
           </w:p>
-        </w:tc>
-      </w:tr>
-      <w:tr>
-        <w:tc>
-          <w:tcPr>
-            <w:tcW w:type="dxa" w:w="10426"/>
-            <w:shd w:fill="E8F3F2" w:val="clear"/>
-            <w:tcBorders>
-              <w:top w:val="single" w:sz="4" w:color="CED9D8"/>
-              <w:left w:val="single" w:sz="4" w:color="CED9D8"/>
-              <w:bottom w:val="single" w:sz="4" w:color="CED9D8"/>
-              <w:right w:val="single" w:sz="4" w:color="CED9D8"/>
-            </w:tcBorders>
-          </w:tcPr>
           <w:p>
             <w:pPr>
-              <w:spacing w:before="0" w:after="0" w:line="276" w:lineRule="auto"/>
+              <w:spacing w:before="0" w:after="0" w:line="264" w:lineRule="auto"/>
             </w:pPr>
             <w:r>
               <w:rPr>
@@ -317,23 +376,9 @@
               <w:t>Attention: Ms. Ojaale Cynthia</w:t>
             </w:r>
           </w:p>
-        </w:tc>
-      </w:tr>
-      <w:tr>
-        <w:tc>
-          <w:tcPr>
-            <w:tcW w:type="dxa" w:w="10426"/>
-            <w:shd w:fill="E8F3F2" w:val="clear"/>
-            <w:tcBorders>
-              <w:top w:val="single" w:sz="4" w:color="CED9D8"/>
-              <w:left w:val="single" w:sz="4" w:color="CED9D8"/>
-              <w:bottom w:val="single" w:sz="4" w:color="CED9D8"/>
-              <w:right w:val="single" w:sz="4" w:color="CED9D8"/>
-            </w:tcBorders>
-          </w:tcPr>
           <w:p>
             <w:pPr>
-              <w:spacing w:before="0" w:after="0" w:line="276" w:lineRule="auto"/>
+              <w:spacing w:before="0" w:after="0" w:line="264" w:lineRule="auto"/>
             </w:pPr>
             <w:r>
               <w:rPr>
@@ -346,23 +391,9 @@
               <w:t>Manager</w:t>
             </w:r>
           </w:p>
-        </w:tc>
-      </w:tr>
-      <w:tr>
-        <w:tc>
-          <w:tcPr>
-            <w:tcW w:type="dxa" w:w="10426"/>
-            <w:shd w:fill="E8F3F2" w:val="clear"/>
-            <w:tcBorders>
-              <w:top w:val="single" w:sz="4" w:color="CED9D8"/>
-              <w:left w:val="single" w:sz="4" w:color="CED9D8"/>
-              <w:bottom w:val="single" w:sz="4" w:color="CED9D8"/>
-              <w:right w:val="single" w:sz="4" w:color="CED9D8"/>
-            </w:tcBorders>
-          </w:tcPr>
           <w:p>
             <w:pPr>
-              <w:spacing w:before="0" w:after="0" w:line="276" w:lineRule="auto"/>
+              <w:spacing w:before="0" w:after="0" w:line="264" w:lineRule="auto"/>
             </w:pPr>
             <w:r>
               <w:rPr>
@@ -375,23 +406,9 @@
               <w:t>Telephone: 0765 593657</w:t>
             </w:r>
           </w:p>
-        </w:tc>
-      </w:tr>
-      <w:tr>
-        <w:tc>
-          <w:tcPr>
-            <w:tcW w:type="dxa" w:w="10426"/>
-            <w:shd w:fill="E8F3F2" w:val="clear"/>
-            <w:tcBorders>
-              <w:top w:val="single" w:sz="4" w:color="CED9D8"/>
-              <w:left w:val="single" w:sz="4" w:color="CED9D8"/>
-              <w:bottom w:val="single" w:sz="4" w:color="CED9D8"/>
-              <w:right w:val="single" w:sz="4" w:color="CED9D8"/>
-            </w:tcBorders>
-          </w:tcPr>
           <w:p>
             <w:pPr>
-              <w:spacing w:before="0" w:after="0" w:line="276" w:lineRule="auto"/>
+              <w:spacing w:before="0" w:after="0" w:line="264" w:lineRule="auto"/>
             </w:pPr>
             <w:r>
               <w:rPr>
@@ -405,42 +422,54 @@
             </w:r>
           </w:p>
         </w:tc>
+        <w:tc>
+          <w:tcPr>
+            <w:tcW w:type="dxa" w:w="5102"/>
+            <w:shd w:fill="E8F3F2" w:val="clear"/>
+            <w:tcBorders>
+              <w:top w:val="single" w:sz="6" w:color="CED9D8"/>
+              <w:left w:val="single" w:sz="6" w:color="CED9D8"/>
+              <w:bottom w:val="single" w:sz="6" w:color="CED9D8"/>
+              <w:right w:val="single" w:sz="6" w:color="CED9D8"/>
+            </w:tcBorders>
+          </w:tcPr>
+          <w:p>
+            <w:pPr>
+              <w:spacing w:before="0" w:after="0" w:line="264" w:lineRule="auto"/>
+            </w:pPr>
+            <w:r>
+              <w:rPr>
+                <w:rFonts w:ascii="Calibri" w:hAnsi="Calibri"/>
+                <w:b/>
+                <w:i w:val="0"/>
+                <w:color w:val="0D6E6E"/>
+                <w:sz w:val="21"/>
+              </w:rPr>
+              <w:t>Description of Services</w:t>
+            </w:r>
+          </w:p>
+          <w:p>
+            <w:pPr>
+              <w:spacing w:before="0" w:after="0" w:line="264" w:lineRule="auto"/>
+            </w:pPr>
+            <w:r>
+              <w:rPr>
+                <w:rFonts w:ascii="Calibri" w:hAnsi="Calibri"/>
+                <w:b w:val="0"/>
+                <w:i w:val="0"/>
+                <w:color w:val="1E2F38"/>
+                <w:sz w:val="19"/>
+              </w:rPr>
+              <w:t>Provision of Medical Examination Services for Food Handlers</w:t>
+            </w:r>
+          </w:p>
+        </w:tc>
       </w:tr>
     </w:tbl>
     <w:p>
       <w:pPr>
-        <w:spacing w:before="160" w:after="0" w:line="276" w:lineRule="auto"/>
+        <w:spacing w:before="200" w:after="0" w:line="264" w:lineRule="auto"/>
       </w:pPr>
-    </w:p>
-    <w:p>
-      <w:pPr>
-        <w:spacing w:before="0" w:after="0" w:line="276" w:lineRule="auto"/>
-      </w:pPr>
-      <w:r>
-        <w:rPr>
-          <w:rFonts w:ascii="Calibri" w:hAnsi="Calibri"/>
-          <w:b/>
-          <w:i w:val="0"/>
-          <w:color w:val="0D6E6E"/>
-          <w:sz w:val="22"/>
-        </w:rPr>
-        <w:t>Description of Services</w:t>
-      </w:r>
-    </w:p>
-    <w:p>
-      <w:pPr>
-        <w:spacing w:before="0" w:after="120" w:line="276" w:lineRule="auto"/>
-      </w:pPr>
-      <w:r>
-        <w:rPr>
-          <w:rFonts w:ascii="Calibri" w:hAnsi="Calibri"/>
-          <w:b/>
-          <w:i w:val="0"/>
-          <w:color w:val="1E2F38"/>
-          <w:sz w:val="19"/>
-        </w:rPr>
-        <w:t>Provision of Medical Examination Services for Food Handlers</w:t>
-      </w:r>
     </w:p>
     <w:tbl>
       <w:tblPr>
@@ -449,26 +478,26 @@
         <w:tblLook w:firstColumn="1" w:firstRow="1" w:lastColumn="0" w:lastRow="0" w:noHBand="0" w:noVBand="1" w:val="04A0"/>
       </w:tblPr>
       <w:tblGrid>
-        <w:gridCol w:w="2606"/>
-        <w:gridCol w:w="2606"/>
-        <w:gridCol w:w="2606"/>
-        <w:gridCol w:w="2606"/>
+        <w:gridCol w:w="2551"/>
+        <w:gridCol w:w="2551"/>
+        <w:gridCol w:w="2551"/>
+        <w:gridCol w:w="2551"/>
       </w:tblGrid>
       <w:tr>
         <w:tc>
           <w:tcPr>
-            <w:tcW w:type="dxa" w:w="4082"/>
-            <w:shd w:fill="0D6E6E" w:val="clear"/>
+            <w:tcW w:type="dxa" w:w="4649"/>
+            <w:shd w:fill="0A1F2E" w:val="clear"/>
             <w:tcBorders>
-              <w:top w:val="single" w:sz="8" w:color="0D6E6E"/>
-              <w:left w:val="single" w:sz="8" w:color="0D6E6E"/>
-              <w:bottom w:val="single" w:sz="8" w:color="0D6E6E"/>
-              <w:right w:val="single" w:sz="8" w:color="0D6E6E"/>
+              <w:top w:val="single" w:sz="8" w:color="0A1F2E"/>
+              <w:left w:val="single" w:sz="8" w:color="0A1F2E"/>
+              <w:bottom w:val="single" w:sz="8" w:color="0A1F2E"/>
+              <w:right w:val="single" w:sz="8" w:color="0A1F2E"/>
             </w:tcBorders>
           </w:tcPr>
           <w:p>
             <w:pPr>
-              <w:spacing w:before="0" w:after="0" w:line="276" w:lineRule="auto"/>
+              <w:spacing w:before="0" w:after="0" w:line="264" w:lineRule="auto"/>
             </w:pPr>
             <w:r>
               <w:rPr>
@@ -485,17 +514,18 @@
         <w:tc>
           <w:tcPr>
             <w:tcW w:type="dxa" w:w="1701"/>
-            <w:shd w:fill="0D6E6E" w:val="clear"/>
+            <w:shd w:fill="0A1F2E" w:val="clear"/>
             <w:tcBorders>
-              <w:top w:val="single" w:sz="8" w:color="0D6E6E"/>
-              <w:left w:val="single" w:sz="8" w:color="0D6E6E"/>
-              <w:bottom w:val="single" w:sz="8" w:color="0D6E6E"/>
-              <w:right w:val="single" w:sz="8" w:color="0D6E6E"/>
+              <w:top w:val="single" w:sz="8" w:color="0A1F2E"/>
+              <w:left w:val="single" w:sz="8" w:color="0A1F2E"/>
+              <w:bottom w:val="single" w:sz="8" w:color="0A1F2E"/>
+              <w:right w:val="single" w:sz="8" w:color="0A1F2E"/>
             </w:tcBorders>
           </w:tcPr>
           <w:p>
             <w:pPr>
-              <w:spacing w:before="0" w:after="0" w:line="276" w:lineRule="auto"/>
+              <w:spacing w:before="0" w:after="0" w:line="264" w:lineRule="auto"/>
+              <w:jc w:val="center"/>
             </w:pPr>
             <w:r>
               <w:rPr>
@@ -512,17 +542,17 @@
         <w:tc>
           <w:tcPr>
             <w:tcW w:type="dxa" w:w="1928"/>
-            <w:shd w:fill="0D6E6E" w:val="clear"/>
+            <w:shd w:fill="0A1F2E" w:val="clear"/>
             <w:tcBorders>
-              <w:top w:val="single" w:sz="8" w:color="0D6E6E"/>
-              <w:left w:val="single" w:sz="8" w:color="0D6E6E"/>
-              <w:bottom w:val="single" w:sz="8" w:color="0D6E6E"/>
-              <w:right w:val="single" w:sz="8" w:color="0D6E6E"/>
+              <w:top w:val="single" w:sz="8" w:color="0A1F2E"/>
+              <w:left w:val="single" w:sz="8" w:color="0A1F2E"/>
+              <w:bottom w:val="single" w:sz="8" w:color="0A1F2E"/>
+              <w:right w:val="single" w:sz="8" w:color="0A1F2E"/>
             </w:tcBorders>
           </w:tcPr>
           <w:p>
             <w:pPr>
-              <w:spacing w:before="0" w:after="0" w:line="276" w:lineRule="auto"/>
+              <w:spacing w:before="0" w:after="0" w:line="264" w:lineRule="auto"/>
               <w:jc w:val="right"/>
             </w:pPr>
             <w:r>
@@ -540,17 +570,17 @@
         <w:tc>
           <w:tcPr>
             <w:tcW w:type="dxa" w:w="1928"/>
-            <w:shd w:fill="0D6E6E" w:val="clear"/>
+            <w:shd w:fill="0A1F2E" w:val="clear"/>
             <w:tcBorders>
-              <w:top w:val="single" w:sz="8" w:color="0D6E6E"/>
-              <w:left w:val="single" w:sz="8" w:color="0D6E6E"/>
-              <w:bottom w:val="single" w:sz="8" w:color="0D6E6E"/>
-              <w:right w:val="single" w:sz="8" w:color="0D6E6E"/>
+              <w:top w:val="single" w:sz="8" w:color="0A1F2E"/>
+              <w:left w:val="single" w:sz="8" w:color="0A1F2E"/>
+              <w:bottom w:val="single" w:sz="8" w:color="0A1F2E"/>
+              <w:right w:val="single" w:sz="8" w:color="0A1F2E"/>
             </w:tcBorders>
           </w:tcPr>
           <w:p>
             <w:pPr>
-              <w:spacing w:before="0" w:after="0" w:line="276" w:lineRule="auto"/>
+              <w:spacing w:before="0" w:after="0" w:line="264" w:lineRule="auto"/>
               <w:jc w:val="right"/>
             </w:pPr>
             <w:r>
@@ -569,17 +599,17 @@
       <w:tr>
         <w:tc>
           <w:tcPr>
-            <w:tcW w:type="dxa" w:w="4082"/>
+            <w:tcW w:type="dxa" w:w="4649"/>
             <w:tcBorders>
-              <w:top w:val="single" w:sz="8" w:color="0D6E6E"/>
-              <w:left w:val="single" w:sz="8" w:color="0D6E6E"/>
-              <w:bottom w:val="single" w:sz="8" w:color="0D6E6E"/>
-              <w:right w:val="single" w:sz="8" w:color="0D6E6E"/>
+              <w:top w:val="single" w:sz="8" w:color="0A1F2E"/>
+              <w:left w:val="single" w:sz="8" w:color="0A1F2E"/>
+              <w:bottom w:val="single" w:sz="8" w:color="0A1F2E"/>
+              <w:right w:val="single" w:sz="8" w:color="0A1F2E"/>
             </w:tcBorders>
           </w:tcPr>
           <w:p>
             <w:pPr>
-              <w:spacing w:before="0" w:after="0" w:line="276" w:lineRule="auto"/>
+              <w:spacing w:before="0" w:after="0" w:line="264" w:lineRule="auto"/>
             </w:pPr>
             <w:r>
               <w:rPr>
@@ -597,15 +627,16 @@
           <w:tcPr>
             <w:tcW w:type="dxa" w:w="1701"/>
             <w:tcBorders>
-              <w:top w:val="single" w:sz="8" w:color="0D6E6E"/>
-              <w:left w:val="single" w:sz="8" w:color="0D6E6E"/>
-              <w:bottom w:val="single" w:sz="8" w:color="0D6E6E"/>
-              <w:right w:val="single" w:sz="8" w:color="0D6E6E"/>
+              <w:top w:val="single" w:sz="8" w:color="0A1F2E"/>
+              <w:left w:val="single" w:sz="8" w:color="0A1F2E"/>
+              <w:bottom w:val="single" w:sz="8" w:color="0A1F2E"/>
+              <w:right w:val="single" w:sz="8" w:color="0A1F2E"/>
             </w:tcBorders>
           </w:tcPr>
           <w:p>
             <w:pPr>
-              <w:spacing w:before="0" w:after="0" w:line="276" w:lineRule="auto"/>
+              <w:spacing w:before="0" w:after="0" w:line="264" w:lineRule="auto"/>
+              <w:jc w:val="center"/>
             </w:pPr>
             <w:r>
               <w:rPr>
@@ -623,15 +654,15 @@
           <w:tcPr>
             <w:tcW w:type="dxa" w:w="1928"/>
             <w:tcBorders>
-              <w:top w:val="single" w:sz="8" w:color="0D6E6E"/>
-              <w:left w:val="single" w:sz="8" w:color="0D6E6E"/>
-              <w:bottom w:val="single" w:sz="8" w:color="0D6E6E"/>
-              <w:right w:val="single" w:sz="8" w:color="0D6E6E"/>
+              <w:top w:val="single" w:sz="8" w:color="0A1F2E"/>
+              <w:left w:val="single" w:sz="8" w:color="0A1F2E"/>
+              <w:bottom w:val="single" w:sz="8" w:color="0A1F2E"/>
+              <w:right w:val="single" w:sz="8" w:color="0A1F2E"/>
             </w:tcBorders>
           </w:tcPr>
           <w:p>
             <w:pPr>
-              <w:spacing w:before="0" w:after="0" w:line="276" w:lineRule="auto"/>
+              <w:spacing w:before="0" w:after="0" w:line="264" w:lineRule="auto"/>
               <w:jc w:val="right"/>
             </w:pPr>
             <w:r>
@@ -650,15 +681,15 @@
           <w:tcPr>
             <w:tcW w:type="dxa" w:w="1928"/>
             <w:tcBorders>
-              <w:top w:val="single" w:sz="8" w:color="0D6E6E"/>
-              <w:left w:val="single" w:sz="8" w:color="0D6E6E"/>
-              <w:bottom w:val="single" w:sz="8" w:color="0D6E6E"/>
-              <w:right w:val="single" w:sz="8" w:color="0D6E6E"/>
+              <w:top w:val="single" w:sz="8" w:color="0A1F2E"/>
+              <w:left w:val="single" w:sz="8" w:color="0A1F2E"/>
+              <w:bottom w:val="single" w:sz="8" w:color="0A1F2E"/>
+              <w:right w:val="single" w:sz="8" w:color="0A1F2E"/>
             </w:tcBorders>
           </w:tcPr>
           <w:p>
             <w:pPr>
-              <w:spacing w:before="0" w:after="0" w:line="276" w:lineRule="auto"/>
+              <w:spacing w:before="0" w:after="0" w:line="264" w:lineRule="auto"/>
               <w:jc w:val="right"/>
             </w:pPr>
             <w:r>
@@ -677,7 +708,7 @@
     </w:tbl>
     <w:p>
       <w:pPr>
-        <w:spacing w:before="120" w:after="0" w:line="276" w:lineRule="auto"/>
+        <w:spacing w:before="40" w:after="0" w:line="264" w:lineRule="auto"/>
       </w:pPr>
     </w:p>
     <w:tbl>
@@ -686,24 +717,24 @@
         <w:tblLook w:firstColumn="1" w:firstRow="1" w:lastColumn="0" w:lastRow="0" w:noHBand="0" w:noVBand="1" w:val="04A0"/>
       </w:tblPr>
       <w:tblGrid>
-        <w:gridCol w:w="5213"/>
-        <w:gridCol w:w="5213"/>
+        <w:gridCol w:w="5103"/>
+        <w:gridCol w:w="5103"/>
       </w:tblGrid>
       <w:tr>
         <w:tc>
           <w:tcPr>
-            <w:tcW w:type="dxa" w:w="5213"/>
+            <w:tcW w:type="dxa" w:w="5103"/>
             <w:shd w:fill="E8F3F2" w:val="clear"/>
             <w:tcBorders>
-              <w:top w:val="single" w:sz="12" w:color="0D6E6E"/>
-              <w:left w:val="single" w:sz="12" w:color="0D6E6E"/>
-              <w:bottom w:val="single" w:sz="12" w:color="0D6E6E"/>
-              <w:right w:val="single" w:sz="12" w:color="0D6E6E"/>
+              <w:top w:val="single" w:sz="14" w:color="0D6E6E"/>
+              <w:left w:val="single" w:sz="14" w:color="0D6E6E"/>
+              <w:bottom w:val="single" w:sz="14" w:color="0D6E6E"/>
+              <w:right w:val="single" w:sz="14" w:color="0D6E6E"/>
             </w:tcBorders>
           </w:tcPr>
           <w:p>
             <w:pPr>
-              <w:spacing w:before="0" w:after="0" w:line="276" w:lineRule="auto"/>
+              <w:spacing w:before="0" w:after="0" w:line="264" w:lineRule="auto"/>
             </w:pPr>
             <w:r>
               <w:rPr>
@@ -711,7 +742,7 @@
                 <w:b/>
                 <w:i w:val="0"/>
                 <w:color w:val="0A1F2E"/>
-                <w:sz w:val="20"/>
+                <w:sz w:val="21"/>
               </w:rPr>
               <w:t>Total Amount Payable</w:t>
             </w:r>
@@ -719,18 +750,18 @@
         </w:tc>
         <w:tc>
           <w:tcPr>
-            <w:tcW w:type="dxa" w:w="5213"/>
+            <w:tcW w:type="dxa" w:w="5103"/>
             <w:shd w:fill="E8F3F2" w:val="clear"/>
             <w:tcBorders>
-              <w:top w:val="single" w:sz="12" w:color="0D6E6E"/>
-              <w:left w:val="single" w:sz="12" w:color="0D6E6E"/>
-              <w:bottom w:val="single" w:sz="12" w:color="0D6E6E"/>
-              <w:right w:val="single" w:sz="12" w:color="0D6E6E"/>
+              <w:top w:val="single" w:sz="14" w:color="0D6E6E"/>
+              <w:left w:val="single" w:sz="14" w:color="0D6E6E"/>
+              <w:bottom w:val="single" w:sz="14" w:color="0D6E6E"/>
+              <w:right w:val="single" w:sz="14" w:color="0D6E6E"/>
             </w:tcBorders>
           </w:tcPr>
           <w:p>
             <w:pPr>
-              <w:spacing w:before="0" w:after="0" w:line="276" w:lineRule="auto"/>
+              <w:spacing w:before="0" w:after="0" w:line="264" w:lineRule="auto"/>
               <w:jc w:val="right"/>
             </w:pPr>
             <w:r>
@@ -739,9 +770,9 @@
                 <w:b/>
                 <w:i w:val="0"/>
                 <w:color w:val="0A1F2E"/>
-                <w:sz w:val="22"/>
+                <w:sz w:val="24"/>
               </w:rPr>
-              <w:t>780,000</w:t>
+              <w:t>UGX 780,000</w:t>
             </w:r>
           </w:p>
         </w:tc>
@@ -749,12 +780,12 @@
     </w:tbl>
     <w:p>
       <w:pPr>
-        <w:spacing w:before="200" w:after="0" w:line="276" w:lineRule="auto"/>
+        <w:spacing w:before="200" w:after="0" w:line="264" w:lineRule="auto"/>
       </w:pPr>
     </w:p>
     <w:p>
       <w:pPr>
-        <w:spacing w:before="80" w:after="40" w:line="276" w:lineRule="auto"/>
+        <w:spacing w:before="0" w:after="0" w:line="264" w:lineRule="auto"/>
       </w:pPr>
       <w:r>
         <w:rPr>
@@ -762,29 +793,57 @@
           <w:b/>
           <w:i w:val="0"/>
           <w:color w:val="0D6E6E"/>
-          <w:sz w:val="22"/>
+          <w:sz w:val="21"/>
         </w:rPr>
         <w:t>Amount in Words</w:t>
       </w:r>
     </w:p>
+    <w:tbl>
+      <w:tblPr>
+        <w:tblW w:type="auto" w:w="0"/>
+        <w:tblLook w:firstColumn="1" w:firstRow="1" w:lastColumn="0" w:lastRow="0" w:noHBand="0" w:noVBand="1" w:val="04A0"/>
+      </w:tblPr>
+      <w:tblGrid>
+        <w:gridCol w:w="10206"/>
+      </w:tblGrid>
+      <w:tr>
+        <w:tc>
+          <w:tcPr>
+            <w:tcW w:type="dxa" w:w="10206"/>
+            <w:shd w:fill="F7F5F0" w:val="clear"/>
+            <w:tcBorders>
+              <w:top w:val="single" w:sz="6" w:color="CED9D8"/>
+              <w:left w:val="single" w:sz="6" w:color="CED9D8"/>
+              <w:bottom w:val="single" w:sz="6" w:color="CED9D8"/>
+              <w:right w:val="single" w:sz="6" w:color="CED9D8"/>
+            </w:tcBorders>
+          </w:tcPr>
+          <w:p>
+            <w:pPr>
+              <w:spacing w:before="0" w:after="0" w:line="264" w:lineRule="auto"/>
+            </w:pPr>
+            <w:r>
+              <w:rPr>
+                <w:rFonts w:ascii="Calibri" w:hAnsi="Calibri"/>
+                <w:b/>
+                <w:i w:val="0"/>
+                <w:color w:val="1E2F38"/>
+                <w:sz w:val="19"/>
+              </w:rPr>
+              <w:t>Uganda Shillings Seven Hundred Eighty Thousand Only (UGX 780,000/=).</w:t>
+            </w:r>
+          </w:p>
+        </w:tc>
+      </w:tr>
+    </w:tbl>
     <w:p>
       <w:pPr>
-        <w:spacing w:before="0" w:after="80" w:line="276" w:lineRule="auto"/>
+        <w:spacing w:before="160" w:after="0" w:line="264" w:lineRule="auto"/>
       </w:pPr>
-      <w:r>
-        <w:rPr>
-          <w:rFonts w:ascii="Calibri" w:hAnsi="Calibri"/>
-          <w:b/>
-          <w:i w:val="0"/>
-          <w:color w:val="1E2F38"/>
-          <w:sz w:val="19"/>
-        </w:rPr>
-        <w:t>Uganda Shillings Seven Hundred Eighty Thousand Only (UGX 780,000/=).</w:t>
-      </w:r>
     </w:p>
     <w:p>
       <w:pPr>
-        <w:spacing w:before="80" w:after="40" w:line="276" w:lineRule="auto"/>
+        <w:spacing w:before="0" w:after="40" w:line="264" w:lineRule="auto"/>
       </w:pPr>
       <w:r>
         <w:rPr>
@@ -792,14 +851,14 @@
           <w:b/>
           <w:i w:val="0"/>
           <w:color w:val="0D6E6E"/>
-          <w:sz w:val="22"/>
+          <w:sz w:val="21"/>
         </w:rPr>
         <w:t>Payment Instructions</w:t>
       </w:r>
     </w:p>
     <w:p>
       <w:pPr>
-        <w:spacing w:before="0" w:after="80" w:line="276" w:lineRule="auto"/>
+        <w:spacing w:before="0" w:after="80" w:line="264" w:lineRule="auto"/>
       </w:pPr>
       <w:r>
         <w:rPr>
@@ -814,7 +873,7 @@
     </w:p>
     <w:p>
       <w:pPr>
-        <w:spacing w:before="0" w:after="160" w:line="276" w:lineRule="auto"/>
+        <w:spacing w:before="0" w:after="160" w:line="264" w:lineRule="auto"/>
       </w:pPr>
       <w:r>
         <w:rPr>
@@ -829,7 +888,7 @@
     </w:p>
     <w:p>
       <w:pPr>
-        <w:spacing w:before="0" w:after="240" w:line="276" w:lineRule="auto"/>
+        <w:spacing w:before="0" w:after="240" w:line="264" w:lineRule="auto"/>
       </w:pPr>
       <w:r>
         <w:rPr>
@@ -844,7 +903,7 @@
     </w:p>
     <w:p>
       <w:pPr>
-        <w:spacing w:before="0" w:after="0" w:line="276" w:lineRule="auto"/>
+        <w:spacing w:before="0" w:after="0" w:line="264" w:lineRule="auto"/>
       </w:pPr>
       <w:r>
         <w:rPr>
@@ -859,17 +918,17 @@
     </w:p>
     <w:p>
       <w:pPr>
-        <w:spacing w:before="120" w:after="0" w:line="276" w:lineRule="auto"/>
+        <w:spacing w:before="120" w:after="0" w:line="264" w:lineRule="auto"/>
       </w:pPr>
     </w:p>
     <w:p>
       <w:pPr>
-        <w:spacing w:before="120" w:after="0" w:line="276" w:lineRule="auto"/>
+        <w:spacing w:before="120" w:after="0" w:line="264" w:lineRule="auto"/>
       </w:pPr>
     </w:p>
     <w:p>
       <w:pPr>
-        <w:spacing w:before="0" w:after="0" w:line="276" w:lineRule="auto"/>
+        <w:spacing w:before="0" w:after="0" w:line="264" w:lineRule="auto"/>
       </w:pPr>
       <w:r>
         <w:rPr>
@@ -884,7 +943,7 @@
     </w:p>
     <w:p>
       <w:pPr>
-        <w:spacing w:before="0" w:after="0" w:line="276" w:lineRule="auto"/>
+        <w:spacing w:before="0" w:after="0" w:line="264" w:lineRule="auto"/>
       </w:pPr>
       <w:r>
         <w:rPr>
@@ -899,7 +958,7 @@
     </w:p>
     <w:p>
       <w:pPr>
-        <w:spacing w:before="0" w:after="0" w:line="276" w:lineRule="auto"/>
+        <w:spacing w:before="0" w:after="0" w:line="264" w:lineRule="auto"/>
       </w:pPr>
       <w:r>
         <w:rPr>
@@ -914,10 +973,10 @@
     </w:p>
     <w:p>
       <w:pPr>
-        <w:spacing w:before="320" w:after="0" w:line="276" w:lineRule="auto"/>
+        <w:spacing w:before="280" w:after="0" w:line="264" w:lineRule="auto"/>
         <w:jc w:val="center"/>
         <w:pBdr>
-          <w:top w:val="single" w:sz="12" w:color="0D6E6E"/>
+          <w:top w:val="single" w:sz="18" w:color="0D6E6E"/>
         </w:pBdr>
       </w:pPr>
       <w:r>
@@ -932,8 +991,8 @@
       </w:r>
     </w:p>
     <w:sectPr>
-      <w:pgSz w:w="12240" w:h="15840"/>
-      <w:pgMar w:top="794" w:right="907" w:bottom="794" w:left="907" w:header="720" w:footer="720" w:gutter="0"/>
+      <w:pgSz w:w="11906" w:h="15840"/>
+      <w:pgMar w:top="680" w:right="850" w:bottom="680" w:left="850" w:header="720" w:footer="720" w:gutter="0"/>
       <w:cols w:space="720"/>
       <w:docGrid w:linePitch="360"/>
     </w:sectPr>

</xml_diff>

<commit_message>
Refine formatting in invoice documents for FairBanks Medical Centre
- Adjusted layout and alignment in `FBMC_INV_2026_0720_001.docx` and `FBMC_INV_2026_0720_001.pdf` to enhance readability and presentation.
- Ensured consistent formatting of contact information and invoice details for improved clarity.
</commit_message>
<xml_diff>
--- a/FBMC_INV_2026_0720_001.docx
+++ b/FBMC_INV_2026_0720_001.docx
@@ -9,14 +9,13 @@
         <w:tblLook w:firstColumn="1" w:firstRow="1" w:lastColumn="0" w:lastRow="0" w:noHBand="0" w:noVBand="1" w:val="04A0"/>
       </w:tblPr>
       <w:tblGrid>
-        <w:gridCol w:w="3402"/>
-        <w:gridCol w:w="3402"/>
-        <w:gridCol w:w="3402"/>
+        <w:gridCol w:w="5103"/>
+        <w:gridCol w:w="5103"/>
       </w:tblGrid>
       <w:tr>
         <w:tc>
           <w:tcPr>
-            <w:tcW w:type="dxa" w:w="1587"/>
+            <w:tcW w:type="dxa" w:w="2608"/>
             <w:shd w:fill="E8F3F2" w:val="clear"/>
             <w:tcBorders>
               <w:top w:val="nil"/>
@@ -28,11 +27,12 @@
           <w:p>
             <w:pPr>
               <w:spacing w:before="0" w:after="0" w:line="264" w:lineRule="auto"/>
+              <w:jc w:val="center"/>
             </w:pPr>
             <w:r>
               <w:drawing>
                 <wp:inline xmlns:a="http://schemas.openxmlformats.org/drawingml/2006/main" xmlns:pic="http://schemas.openxmlformats.org/drawingml/2006/picture">
-                  <wp:extent cx="822960" cy="308992"/>
+                  <wp:extent cx="1554480" cy="583652"/>
                   <wp:docPr id="1" name="Picture 1"/>
                   <wp:cNvGraphicFramePr>
                     <a:graphicFrameLocks noChangeAspect="1"/>
@@ -53,7 +53,7 @@
                         <pic:spPr>
                           <a:xfrm>
                             <a:off x="0" y="0"/>
-                            <a:ext cx="822960" cy="308992"/>
+                            <a:ext cx="1554480" cy="583652"/>
                           </a:xfrm>
                           <a:prstGeom prst="rect"/>
                         </pic:spPr>
@@ -67,7 +67,7 @@
         </w:tc>
         <w:tc>
           <w:tcPr>
-            <w:tcW w:type="dxa" w:w="5953"/>
+            <w:tcW w:type="dxa" w:w="7597"/>
             <w:shd w:fill="E8F3F2" w:val="clear"/>
             <w:tcBorders>
               <w:top w:val="nil"/>
@@ -86,7 +86,7 @@
                 <w:b/>
                 <w:i w:val="0"/>
                 <w:color w:val="0A1F2E"/>
-                <w:sz w:val="30"/>
+                <w:sz w:val="28"/>
               </w:rPr>
               <w:t>FAIRBANKS MEDICAL CENTRE</w:t>
             </w:r>
@@ -116,15 +116,29 @@
                 <w:b w:val="0"/>
                 <w:i w:val="0"/>
                 <w:color w:val="52636C"/>
-                <w:sz w:val="17"/>
+                <w:sz w:val="16"/>
               </w:rPr>
               <w:t>Kyebando Kisalosalo, Tirupati Road, Opposite Northern Bypass Roundabout, Kampala, Uganda</w:t>
             </w:r>
           </w:p>
         </w:tc>
+      </w:tr>
+    </w:tbl>
+    <w:tbl>
+      <w:tblPr>
+        <w:tblW w:type="auto" w:w="0"/>
+        <w:tblLayout w:type="fixed"/>
+        <w:tblLook w:firstColumn="1" w:firstRow="1" w:lastColumn="0" w:lastRow="0" w:noHBand="0" w:noVBand="1" w:val="04A0"/>
+      </w:tblPr>
+      <w:tblGrid>
+        <w:gridCol w:w="3402"/>
+        <w:gridCol w:w="3402"/>
+        <w:gridCol w:w="3402"/>
+      </w:tblGrid>
+      <w:tr>
         <w:tc>
           <w:tcPr>
-            <w:tcW w:type="dxa" w:w="2665"/>
+            <w:tcW w:type="dxa" w:w="3402"/>
             <w:shd w:fill="E8F3F2" w:val="clear"/>
             <w:tcBorders>
               <w:top w:val="nil"/>
@@ -136,7 +150,7 @@
           <w:p>
             <w:pPr>
               <w:spacing w:before="0" w:after="0" w:line="264" w:lineRule="auto"/>
-              <w:jc w:val="right"/>
+              <w:jc w:val="center"/>
             </w:pPr>
             <w:r>
               <w:rPr>
@@ -144,15 +158,27 @@
                 <w:b w:val="0"/>
                 <w:i w:val="0"/>
                 <w:color w:val="52636C"/>
-                <w:sz w:val="17"/>
+                <w:sz w:val="16"/>
               </w:rPr>
               <w:t>Tel: 0777 462 398 | 0748 319 052</w:t>
             </w:r>
           </w:p>
+        </w:tc>
+        <w:tc>
+          <w:tcPr>
+            <w:tcW w:type="dxa" w:w="3402"/>
+            <w:shd w:fill="E8F3F2" w:val="clear"/>
+            <w:tcBorders>
+              <w:top w:val="nil"/>
+              <w:left w:val="nil"/>
+              <w:bottom w:val="nil"/>
+              <w:right w:val="nil"/>
+            </w:tcBorders>
+          </w:tcPr>
           <w:p>
             <w:pPr>
               <w:spacing w:before="0" w:after="0" w:line="264" w:lineRule="auto"/>
-              <w:jc w:val="right"/>
+              <w:jc w:val="center"/>
             </w:pPr>
             <w:r>
               <w:rPr>
@@ -160,15 +186,27 @@
                 <w:b w:val="0"/>
                 <w:i w:val="0"/>
                 <w:color w:val="52636C"/>
-                <w:sz w:val="17"/>
+                <w:sz w:val="16"/>
               </w:rPr>
               <w:t>Email: info@fairbanksmedicalcentre.org</w:t>
             </w:r>
           </w:p>
+        </w:tc>
+        <w:tc>
+          <w:tcPr>
+            <w:tcW w:type="dxa" w:w="3402"/>
+            <w:shd w:fill="E8F3F2" w:val="clear"/>
+            <w:tcBorders>
+              <w:top w:val="nil"/>
+              <w:left w:val="nil"/>
+              <w:bottom w:val="nil"/>
+              <w:right w:val="nil"/>
+            </w:tcBorders>
+          </w:tcPr>
           <w:p>
             <w:pPr>
               <w:spacing w:before="0" w:after="0" w:line="264" w:lineRule="auto"/>
-              <w:jc w:val="right"/>
+              <w:jc w:val="center"/>
             </w:pPr>
             <w:r>
               <w:rPr>
@@ -176,7 +214,7 @@
                 <w:b w:val="0"/>
                 <w:i w:val="0"/>
                 <w:color w:val="52636C"/>
-                <w:sz w:val="17"/>
+                <w:sz w:val="16"/>
               </w:rPr>
               <w:t>Website: www.fairbanksmedicalcentre.org</w:t>
             </w:r>

</xml_diff>

<commit_message>
Refine contact information layout in invoice documents for FairBanks Medical Centre
- Adjusted the formatting of contact details in `FBMC_INV_2026_0720_001.docx` and `FBMC_INV_2026_0720_001.pdf` for improved readability and consistency.
- Added a new signature image file `signature.jpeg` to enhance the professional appearance of the invoice.
</commit_message>
<xml_diff>
--- a/FBMC_INV_2026_0720_001.docx
+++ b/FBMC_INV_2026_0720_001.docx
@@ -15,8 +15,8 @@
       <w:tr>
         <w:tc>
           <w:tcPr>
-            <w:tcW w:type="dxa" w:w="2608"/>
-            <w:shd w:fill="E8F3F2" w:val="clear"/>
+            <w:tcW w:type="dxa" w:w="3288"/>
+            <w:shd w:fill="FFFFFF" w:val="clear"/>
             <w:tcBorders>
               <w:top w:val="nil"/>
               <w:left w:val="nil"/>
@@ -32,7 +32,7 @@
             <w:r>
               <w:drawing>
                 <wp:inline xmlns:a="http://schemas.openxmlformats.org/drawingml/2006/main" xmlns:pic="http://schemas.openxmlformats.org/drawingml/2006/picture">
-                  <wp:extent cx="1554480" cy="583652"/>
+                  <wp:extent cx="1874519" cy="703816"/>
                   <wp:docPr id="1" name="Picture 1"/>
                   <wp:cNvGraphicFramePr>
                     <a:graphicFrameLocks noChangeAspect="1"/>
@@ -53,7 +53,7 @@
                         <pic:spPr>
                           <a:xfrm>
                             <a:off x="0" y="0"/>
-                            <a:ext cx="1554480" cy="583652"/>
+                            <a:ext cx="1874519" cy="703816"/>
                           </a:xfrm>
                           <a:prstGeom prst="rect"/>
                         </pic:spPr>
@@ -67,7 +67,7 @@
         </w:tc>
         <w:tc>
           <w:tcPr>
-            <w:tcW w:type="dxa" w:w="7597"/>
+            <w:tcW w:type="dxa" w:w="6917"/>
             <w:shd w:fill="E8F3F2" w:val="clear"/>
             <w:tcBorders>
               <w:top w:val="nil"/>
@@ -86,7 +86,7 @@
                 <w:b/>
                 <w:i w:val="0"/>
                 <w:color w:val="0A1F2E"/>
-                <w:sz w:val="28"/>
+                <w:sz w:val="26"/>
               </w:rPr>
               <w:t>FAIRBANKS MEDICAL CENTRE</w:t>
             </w:r>
@@ -106,21 +106,6 @@
               <w:t>Your Health, Our Mission</w:t>
             </w:r>
           </w:p>
-          <w:p>
-            <w:pPr>
-              <w:spacing w:before="0" w:after="0" w:line="264" w:lineRule="auto"/>
-            </w:pPr>
-            <w:r>
-              <w:rPr>
-                <w:rFonts w:ascii="Calibri" w:hAnsi="Calibri"/>
-                <w:b w:val="0"/>
-                <w:i w:val="0"/>
-                <w:color w:val="52636C"/>
-                <w:sz w:val="16"/>
-              </w:rPr>
-              <w:t>Kyebando Kisalosalo, Tirupati Road, Opposite Northern Bypass Roundabout, Kampala, Uganda</w:t>
-            </w:r>
-          </w:p>
         </w:tc>
       </w:tr>
     </w:tbl>
@@ -131,14 +116,12 @@
         <w:tblLook w:firstColumn="1" w:firstRow="1" w:lastColumn="0" w:lastRow="0" w:noHBand="0" w:noVBand="1" w:val="04A0"/>
       </w:tblPr>
       <w:tblGrid>
-        <w:gridCol w:w="3402"/>
-        <w:gridCol w:w="3402"/>
-        <w:gridCol w:w="3402"/>
+        <w:gridCol w:w="10206"/>
       </w:tblGrid>
       <w:tr>
         <w:tc>
           <w:tcPr>
-            <w:tcW w:type="dxa" w:w="3402"/>
+            <w:tcW w:type="dxa" w:w="10205"/>
             <w:shd w:fill="E8F3F2" w:val="clear"/>
             <w:tcBorders>
               <w:top w:val="nil"/>
@@ -160,13 +143,15 @@
                 <w:color w:val="52636C"/>
                 <w:sz w:val="16"/>
               </w:rPr>
-              <w:t>Tel: 0777 462 398 | 0748 319 052</w:t>
+              <w:t>Kyebando Kisalosalo, Tirupati Road, Opposite Northern Bypass Roundabout, Kampala, Uganda</w:t>
             </w:r>
           </w:p>
         </w:tc>
+      </w:tr>
+      <w:tr>
         <w:tc>
           <w:tcPr>
-            <w:tcW w:type="dxa" w:w="3402"/>
+            <w:tcW w:type="dxa" w:w="10205"/>
             <w:shd w:fill="E8F3F2" w:val="clear"/>
             <w:tcBorders>
               <w:top w:val="nil"/>
@@ -188,35 +173,7 @@
                 <w:color w:val="52636C"/>
                 <w:sz w:val="16"/>
               </w:rPr>
-              <w:t>Email: info@fairbanksmedicalcentre.org</w:t>
-            </w:r>
-          </w:p>
-        </w:tc>
-        <w:tc>
-          <w:tcPr>
-            <w:tcW w:type="dxa" w:w="3402"/>
-            <w:shd w:fill="E8F3F2" w:val="clear"/>
-            <w:tcBorders>
-              <w:top w:val="nil"/>
-              <w:left w:val="nil"/>
-              <w:bottom w:val="nil"/>
-              <w:right w:val="nil"/>
-            </w:tcBorders>
-          </w:tcPr>
-          <w:p>
-            <w:pPr>
-              <w:spacing w:before="0" w:after="0" w:line="264" w:lineRule="auto"/>
-              <w:jc w:val="center"/>
-            </w:pPr>
-            <w:r>
-              <w:rPr>
-                <w:rFonts w:ascii="Calibri" w:hAnsi="Calibri"/>
-                <w:b w:val="0"/>
-                <w:i w:val="0"/>
-                <w:color w:val="52636C"/>
-                <w:sz w:val="16"/>
-              </w:rPr>
-              <w:t>Website: www.fairbanksmedicalcentre.org</w:t>
+              <w:t>Tel: 0777 462 398 | 0748 319 052      Email: info@fairbanksmedicalcentre.org      Website: www.fairbanksmedicalcentre.org</w:t>
             </w:r>
           </w:p>
         </w:tc>

</xml_diff>

<commit_message>
Remove extra line breaks in invoice documents for FairBanks Medical Centre
- Cleaned up formatting in `FBMC_INV_2026_0720_001.docx` and `FBMC_INV_2026_0720_001.pdf` by removing unnecessary line breaks to enhance document presentation and readability.
</commit_message>
<xml_diff>
--- a/FBMC_INV_2026_0720_001.docx
+++ b/FBMC_INV_2026_0720_001.docx
@@ -913,13 +913,42 @@
     </w:p>
     <w:p>
       <w:pPr>
-        <w:spacing w:before="120" w:after="0" w:line="264" w:lineRule="auto"/>
+        <w:spacing w:before="80" w:after="40" w:line="264" w:lineRule="auto"/>
       </w:pPr>
-    </w:p>
-    <w:p>
-      <w:pPr>
-        <w:spacing w:before="120" w:after="0" w:line="264" w:lineRule="auto"/>
-      </w:pPr>
+      <w:r>
+        <w:drawing>
+          <wp:inline xmlns:a="http://schemas.openxmlformats.org/drawingml/2006/main" xmlns:pic="http://schemas.openxmlformats.org/drawingml/2006/picture">
+            <wp:extent cx="1097280" cy="854696"/>
+            <wp:docPr id="2" name="Picture 2"/>
+            <wp:cNvGraphicFramePr>
+              <a:graphicFrameLocks noChangeAspect="1"/>
+            </wp:cNvGraphicFramePr>
+            <a:graphic>
+              <a:graphicData uri="http://schemas.openxmlformats.org/drawingml/2006/picture">
+                <pic:pic>
+                  <pic:nvPicPr>
+                    <pic:cNvPr id="0" name="signature.png"/>
+                    <pic:cNvPicPr/>
+                  </pic:nvPicPr>
+                  <pic:blipFill>
+                    <a:blip r:embed="rId10"/>
+                    <a:stretch>
+                      <a:fillRect/>
+                    </a:stretch>
+                  </pic:blipFill>
+                  <pic:spPr>
+                    <a:xfrm>
+                      <a:off x="0" y="0"/>
+                      <a:ext cx="1097280" cy="854696"/>
+                    </a:xfrm>
+                    <a:prstGeom prst="rect"/>
+                  </pic:spPr>
+                </pic:pic>
+              </a:graphicData>
+            </a:graphic>
+          </wp:inline>
+        </w:drawing>
+      </w:r>
     </w:p>
     <w:p>
       <w:pPr>

</xml_diff>